<commit_message>
Convert Issue No. 1 source links to e-qanun (with portal fallback)
Eleven of the fourteen articles now link to their verified e-qanun framework
pages (IDs resolved via api.e-qanun.az by matching number + date + type):
01→61987, 02→61986, 03→61985, 05→62002, 06→62000, 07→61993, 08→61994,
09→62004, 11→61988, 12→61990, 13→61995.

The three 12-June instruments that e-qanun has not yet registered (the register
currently stops at 10 June / id 62002) — the airport-management decree, the
renewable-energy land decisions 176–178, and the June Cabinet execution orders
— link instead to their official portal page (president.az / nk.gov.az) with a
visible "not yet registered on e-qanun" note, rather than a fabricated link.

- gazette_lib.py: source rendering generalised to (prefix, links, note) so a
  linked portal fallback with a note is supported alongside e-qanun ids.

https://claude.ai/code/session_011jCTbKPhqz7XeSjPV7EWdE
</commit_message>
<xml_diff>
--- a/scripts/gazettes/Omni-Law-Gazette-Issue-1-2026-06-12-AZ.docx
+++ b/scripts/gazettes/Omni-Law-Gazette-Issue-1-2026-06-12-AZ.docx
@@ -195,8 +195,20 @@
           <w:color w:val="8A6D1E"/>
           <w:sz w:val="16"/>
         </w:rPr>
-        <w:t>Mənbə · e-qanun.az/framework/62002</w:t>
+        <w:t>Mənbə · e-qanun.az/framework/</w:t>
       </w:r>
+      <w:hyperlink r:id="rId9">
+        <w:r>
+          <w:rPr>
+            <w:rFonts w:ascii="Times New Roman" w:hAnsi="Times New Roman" w:cs="Times New Roman"/>
+            <w:sz w:val="16"/>
+            <w:i/>
+            <w:color w:val="8A6D1E"/>
+            <w:u w:val="single"/>
+          </w:rPr>
+          <w:t xml:space="preserve">61987</w:t>
+        </w:r>
+      </w:hyperlink>
     </w:p>
     <w:p>
       <w:pPr>
@@ -301,8 +313,20 @@
           <w:color w:val="8A6D1E"/>
           <w:sz w:val="16"/>
         </w:rPr>
-        <w:t>Mənbə · president.az/az/articles/view/72713</w:t>
+        <w:t>Mənbə · e-qanun.az/framework/</w:t>
       </w:r>
+      <w:hyperlink r:id="rId10">
+        <w:r>
+          <w:rPr>
+            <w:rFonts w:ascii="Times New Roman" w:hAnsi="Times New Roman" w:cs="Times New Roman"/>
+            <w:sz w:val="16"/>
+            <w:i/>
+            <w:color w:val="8A6D1E"/>
+            <w:u w:val="single"/>
+          </w:rPr>
+          <w:t xml:space="preserve">61986</w:t>
+        </w:r>
+      </w:hyperlink>
     </w:p>
     <w:p>
       <w:pPr>
@@ -397,8 +421,20 @@
           <w:color w:val="8A6D1E"/>
           <w:sz w:val="16"/>
         </w:rPr>
-        <w:t>Mənbə · president.az/az/articles/view/72706</w:t>
+        <w:t>Mənbə · e-qanun.az/framework/</w:t>
       </w:r>
+      <w:hyperlink r:id="rId11">
+        <w:r>
+          <w:rPr>
+            <w:rFonts w:ascii="Times New Roman" w:hAnsi="Times New Roman" w:cs="Times New Roman"/>
+            <w:sz w:val="16"/>
+            <w:i/>
+            <w:color w:val="8A6D1E"/>
+            <w:u w:val="single"/>
+          </w:rPr>
+          <w:t xml:space="preserve">61985</w:t>
+        </w:r>
+      </w:hyperlink>
     </w:p>
     <w:p>
       <w:pPr>
@@ -493,7 +529,29 @@
           <w:color w:val="8A6D1E"/>
           <w:sz w:val="16"/>
         </w:rPr>
-        <w:t>Mənbə · president.az/az/articles/view/72735</w:t>
+        <w:t xml:space="preserve">Mənbə · </w:t>
+      </w:r>
+      <w:hyperlink r:id="rId12">
+        <w:r>
+          <w:rPr>
+            <w:rFonts w:ascii="Times New Roman" w:hAnsi="Times New Roman" w:cs="Times New Roman"/>
+            <w:sz w:val="16"/>
+            <w:i/>
+            <w:color w:val="8A6D1E"/>
+            <w:u w:val="single"/>
+          </w:rPr>
+          <w:t xml:space="preserve">president.az/articles/view/72735</w:t>
+        </w:r>
+      </w:hyperlink>
+      <w:r>
+        <w:rPr>
+          <w:rFonts w:ascii="Times New Roman" w:hAnsi="Times New Roman" w:cs="Times New Roman"/>
+          <w:b w:val="0"/>
+          <w:i/>
+          <w:color w:val="8A6D1E"/>
+          <w:sz w:val="16"/>
+        </w:rPr>
+        <w:t xml:space="preserve"> (e-qanun-da hələ qeydiyyatda deyil)</w:t>
       </w:r>
     </w:p>
     <w:p>
@@ -589,8 +647,20 @@
           <w:color w:val="8A6D1E"/>
           <w:sz w:val="16"/>
         </w:rPr>
-        <w:t>Mənbə · president.az/az/articles/view/72724</w:t>
+        <w:t>Mənbə · e-qanun.az/framework/</w:t>
       </w:r>
+      <w:hyperlink r:id="rId13">
+        <w:r>
+          <w:rPr>
+            <w:rFonts w:ascii="Times New Roman" w:hAnsi="Times New Roman" w:cs="Times New Roman"/>
+            <w:sz w:val="16"/>
+            <w:i/>
+            <w:color w:val="8A6D1E"/>
+            <w:u w:val="single"/>
+          </w:rPr>
+          <w:t xml:space="preserve">62002</w:t>
+        </w:r>
+      </w:hyperlink>
     </w:p>
     <w:p>
       <w:pPr>
@@ -685,8 +755,20 @@
           <w:color w:val="8A6D1E"/>
           <w:sz w:val="16"/>
         </w:rPr>
-        <w:t>Mənbə · president.az/az/articles/view/72722</w:t>
+        <w:t>Mənbə · e-qanun.az/framework/</w:t>
       </w:r>
+      <w:hyperlink r:id="rId14">
+        <w:r>
+          <w:rPr>
+            <w:rFonts w:ascii="Times New Roman" w:hAnsi="Times New Roman" w:cs="Times New Roman"/>
+            <w:sz w:val="16"/>
+            <w:i/>
+            <w:color w:val="8A6D1E"/>
+            <w:u w:val="single"/>
+          </w:rPr>
+          <w:t xml:space="preserve">62000</w:t>
+        </w:r>
+      </w:hyperlink>
     </w:p>
     <w:p>
       <w:pPr>
@@ -781,8 +863,20 @@
           <w:color w:val="8A6D1E"/>
           <w:sz w:val="16"/>
         </w:rPr>
-        <w:t>Mənbə · nk.gov.az · Qərar № 171</w:t>
+        <w:t>Mənbə · e-qanun.az/framework/</w:t>
       </w:r>
+      <w:hyperlink r:id="rId15">
+        <w:r>
+          <w:rPr>
+            <w:rFonts w:ascii="Times New Roman" w:hAnsi="Times New Roman" w:cs="Times New Roman"/>
+            <w:sz w:val="16"/>
+            <w:i/>
+            <w:color w:val="8A6D1E"/>
+            <w:u w:val="single"/>
+          </w:rPr>
+          <w:t xml:space="preserve">61993</w:t>
+        </w:r>
+      </w:hyperlink>
     </w:p>
     <w:p>
       <w:pPr>
@@ -877,8 +971,20 @@
           <w:color w:val="8A6D1E"/>
           <w:sz w:val="16"/>
         </w:rPr>
-        <w:t>Mənbə · nk.gov.az · Qərar № 173</w:t>
+        <w:t>Mənbə · e-qanun.az/framework/</w:t>
       </w:r>
+      <w:hyperlink r:id="rId16">
+        <w:r>
+          <w:rPr>
+            <w:rFonts w:ascii="Times New Roman" w:hAnsi="Times New Roman" w:cs="Times New Roman"/>
+            <w:sz w:val="16"/>
+            <w:i/>
+            <w:color w:val="8A6D1E"/>
+            <w:u w:val="single"/>
+          </w:rPr>
+          <w:t xml:space="preserve">61994</w:t>
+        </w:r>
+      </w:hyperlink>
     </w:p>
     <w:p>
       <w:pPr>
@@ -973,8 +1079,20 @@
           <w:color w:val="8A6D1E"/>
           <w:sz w:val="16"/>
         </w:rPr>
-        <w:t>Mənbə · nk.gov.az · Qərar № 174</w:t>
+        <w:t>Mənbə · e-qanun.az/framework/</w:t>
       </w:r>
+      <w:hyperlink r:id="rId17">
+        <w:r>
+          <w:rPr>
+            <w:rFonts w:ascii="Times New Roman" w:hAnsi="Times New Roman" w:cs="Times New Roman"/>
+            <w:sz w:val="16"/>
+            <w:i/>
+            <w:color w:val="8A6D1E"/>
+            <w:u w:val="single"/>
+          </w:rPr>
+          <w:t xml:space="preserve">62004</w:t>
+        </w:r>
+      </w:hyperlink>
     </w:p>
     <w:p>
       <w:pPr>
@@ -1069,7 +1187,29 @@
           <w:color w:val="8A6D1E"/>
           <w:sz w:val="16"/>
         </w:rPr>
-        <w:t>Mənbə · nk.gov.az · Qərarlar № 176–178</w:t>
+        <w:t xml:space="preserve">Mənbə · </w:t>
+      </w:r>
+      <w:hyperlink r:id="rId18">
+        <w:r>
+          <w:rPr>
+            <w:rFonts w:ascii="Times New Roman" w:hAnsi="Times New Roman" w:cs="Times New Roman"/>
+            <w:sz w:val="16"/>
+            <w:i/>
+            <w:color w:val="8A6D1E"/>
+            <w:u w:val="single"/>
+          </w:rPr>
+          <w:t xml:space="preserve">nk.gov.az · Qərar 178</w:t>
+        </w:r>
+      </w:hyperlink>
+      <w:r>
+        <w:rPr>
+          <w:rFonts w:ascii="Times New Roman" w:hAnsi="Times New Roman" w:cs="Times New Roman"/>
+          <w:b w:val="0"/>
+          <w:i/>
+          <w:color w:val="8A6D1E"/>
+          <w:sz w:val="16"/>
+        </w:rPr>
+        <w:t xml:space="preserve"> (e-qanun-da hələ qeydiyyatda deyil)</w:t>
       </w:r>
     </w:p>
     <w:p>
@@ -1165,8 +1305,20 @@
           <w:color w:val="8A6D1E"/>
           <w:sz w:val="16"/>
         </w:rPr>
-        <w:t>Mənbə · nk.gov.az · Qərar № 169</w:t>
+        <w:t>Mənbə · e-qanun.az/framework/</w:t>
       </w:r>
+      <w:hyperlink r:id="rId19">
+        <w:r>
+          <w:rPr>
+            <w:rFonts w:ascii="Times New Roman" w:hAnsi="Times New Roman" w:cs="Times New Roman"/>
+            <w:sz w:val="16"/>
+            <w:i/>
+            <w:color w:val="8A6D1E"/>
+            <w:u w:val="single"/>
+          </w:rPr>
+          <w:t xml:space="preserve">61988</w:t>
+        </w:r>
+      </w:hyperlink>
     </w:p>
     <w:p>
       <w:pPr>
@@ -1261,8 +1413,20 @@
           <w:color w:val="8A6D1E"/>
           <w:sz w:val="16"/>
         </w:rPr>
-        <w:t>Mənbə · nk.gov.az · Qərar № 170</w:t>
+        <w:t>Mənbə · e-qanun.az/framework/</w:t>
       </w:r>
+      <w:hyperlink r:id="rId20">
+        <w:r>
+          <w:rPr>
+            <w:rFonts w:ascii="Times New Roman" w:hAnsi="Times New Roman" w:cs="Times New Roman"/>
+            <w:sz w:val="16"/>
+            <w:i/>
+            <w:color w:val="8A6D1E"/>
+            <w:u w:val="single"/>
+          </w:rPr>
+          <w:t xml:space="preserve">61990</w:t>
+        </w:r>
+      </w:hyperlink>
     </w:p>
     <w:p>
       <w:pPr>
@@ -1357,8 +1521,20 @@
           <w:color w:val="8A6D1E"/>
           <w:sz w:val="16"/>
         </w:rPr>
-        <w:t>Mənbə · nk.gov.az · Qərar № 168</w:t>
+        <w:t>Mənbə · e-qanun.az/framework/</w:t>
       </w:r>
+      <w:hyperlink r:id="rId21">
+        <w:r>
+          <w:rPr>
+            <w:rFonts w:ascii="Times New Roman" w:hAnsi="Times New Roman" w:cs="Times New Roman"/>
+            <w:sz w:val="16"/>
+            <w:i/>
+            <w:color w:val="8A6D1E"/>
+            <w:u w:val="single"/>
+          </w:rPr>
+          <w:t xml:space="preserve">61995</w:t>
+        </w:r>
+      </w:hyperlink>
     </w:p>
     <w:p>
       <w:pPr>
@@ -1453,7 +1629,29 @@
           <w:color w:val="8A6D1E"/>
           <w:sz w:val="16"/>
         </w:rPr>
-        <w:t>Mənbə · nk.gov.az · Sərəncamlar № 389s, 400s, 402s, 403s</w:t>
+        <w:t xml:space="preserve">Mənbə · </w:t>
+      </w:r>
+      <w:hyperlink r:id="rId22">
+        <w:r>
+          <w:rPr>
+            <w:rFonts w:ascii="Times New Roman" w:hAnsi="Times New Roman" w:cs="Times New Roman"/>
+            <w:sz w:val="16"/>
+            <w:i/>
+            <w:color w:val="8A6D1E"/>
+            <w:u w:val="single"/>
+          </w:rPr>
+          <w:t xml:space="preserve">nk.gov.az · Sərəncam 403s</w:t>
+        </w:r>
+      </w:hyperlink>
+      <w:r>
+        <w:rPr>
+          <w:rFonts w:ascii="Times New Roman" w:hAnsi="Times New Roman" w:cs="Times New Roman"/>
+          <w:b w:val="0"/>
+          <w:i/>
+          <w:color w:val="8A6D1E"/>
+          <w:sz w:val="16"/>
+        </w:rPr>
+        <w:t xml:space="preserve"> (e-qanun-da hələ qeydiyyatda deyil)</w:t>
       </w:r>
     </w:p>
     <w:p>

</xml_diff>